<commit_message>
feat: consolidacion total Acto II Scavengers (escenas 11, 12 y 13), storyboard y actualizacion general
</commit_message>
<xml_diff>
--- a/_DOCUMENTACION/BUROFAX/BUROFAX_RECLAMACION_EQUIPOS.docx
+++ b/_DOCUMENTACION/BUROFAX/BUROFAX_RECLAMACION_EQUIPOS.docx
@@ -375,6 +375,18 @@
     </w:p>
     <w:p>
       <w:pPr>
+        <w:pStyle w:val="Prrafodelista"/>
+        <w:numPr>
+          <w:ilvl w:val="0"/>
+          <w:numId w:val="10"/>
+        </w:numPr>
+      </w:pPr>
+      <w:r>
+        <w:t>1 mio para música y otro medias con el demandado para video y cine</w:t>
+      </w:r>
+    </w:p>
+    <w:p>
+      <w:pPr>
         <w:ind w:left="360"/>
       </w:pPr>
       <w:r>
@@ -706,6 +718,92 @@
       </w:rPr>
     </w:lvl>
   </w:abstractNum>
+  <w:abstractNum w:abstractNumId="9" w15:restartNumberingAfterBreak="0">
+    <w:nsid w:val="48C855BB"/>
+    <w:multiLevelType w:val="hybridMultilevel"/>
+    <w:tmpl w:val="7B5E4F56"/>
+    <w:lvl w:ilvl="0" w:tplc="0C0A0017">
+      <w:start w:val="1"/>
+      <w:numFmt w:val="lowerLetter"/>
+      <w:lvlText w:val="%1)"/>
+      <w:lvlJc w:val="left"/>
+      <w:pPr>
+        <w:ind w:left="1080" w:hanging="360"/>
+      </w:pPr>
+    </w:lvl>
+    <w:lvl w:ilvl="1" w:tplc="0C0A0019" w:tentative="1">
+      <w:start w:val="1"/>
+      <w:numFmt w:val="lowerLetter"/>
+      <w:lvlText w:val="%2."/>
+      <w:lvlJc w:val="left"/>
+      <w:pPr>
+        <w:ind w:left="1800" w:hanging="360"/>
+      </w:pPr>
+    </w:lvl>
+    <w:lvl w:ilvl="2" w:tplc="0C0A001B" w:tentative="1">
+      <w:start w:val="1"/>
+      <w:numFmt w:val="lowerRoman"/>
+      <w:lvlText w:val="%3."/>
+      <w:lvlJc w:val="right"/>
+      <w:pPr>
+        <w:ind w:left="2520" w:hanging="180"/>
+      </w:pPr>
+    </w:lvl>
+    <w:lvl w:ilvl="3" w:tplc="0C0A000F" w:tentative="1">
+      <w:start w:val="1"/>
+      <w:numFmt w:val="decimal"/>
+      <w:lvlText w:val="%4."/>
+      <w:lvlJc w:val="left"/>
+      <w:pPr>
+        <w:ind w:left="3240" w:hanging="360"/>
+      </w:pPr>
+    </w:lvl>
+    <w:lvl w:ilvl="4" w:tplc="0C0A0019" w:tentative="1">
+      <w:start w:val="1"/>
+      <w:numFmt w:val="lowerLetter"/>
+      <w:lvlText w:val="%5."/>
+      <w:lvlJc w:val="left"/>
+      <w:pPr>
+        <w:ind w:left="3960" w:hanging="360"/>
+      </w:pPr>
+    </w:lvl>
+    <w:lvl w:ilvl="5" w:tplc="0C0A001B" w:tentative="1">
+      <w:start w:val="1"/>
+      <w:numFmt w:val="lowerRoman"/>
+      <w:lvlText w:val="%6."/>
+      <w:lvlJc w:val="right"/>
+      <w:pPr>
+        <w:ind w:left="4680" w:hanging="180"/>
+      </w:pPr>
+    </w:lvl>
+    <w:lvl w:ilvl="6" w:tplc="0C0A000F" w:tentative="1">
+      <w:start w:val="1"/>
+      <w:numFmt w:val="decimal"/>
+      <w:lvlText w:val="%7."/>
+      <w:lvlJc w:val="left"/>
+      <w:pPr>
+        <w:ind w:left="5400" w:hanging="360"/>
+      </w:pPr>
+    </w:lvl>
+    <w:lvl w:ilvl="7" w:tplc="0C0A0019" w:tentative="1">
+      <w:start w:val="1"/>
+      <w:numFmt w:val="lowerLetter"/>
+      <w:lvlText w:val="%8."/>
+      <w:lvlJc w:val="left"/>
+      <w:pPr>
+        <w:ind w:left="6120" w:hanging="360"/>
+      </w:pPr>
+    </w:lvl>
+    <w:lvl w:ilvl="8" w:tplc="0C0A001B" w:tentative="1">
+      <w:start w:val="1"/>
+      <w:numFmt w:val="lowerRoman"/>
+      <w:lvlText w:val="%9."/>
+      <w:lvlJc w:val="right"/>
+      <w:pPr>
+        <w:ind w:left="6840" w:hanging="180"/>
+      </w:pPr>
+    </w:lvl>
+  </w:abstractNum>
   <w:num w:numId="1" w16cid:durableId="951596414">
     <w:abstractNumId w:val="8"/>
   </w:num>
@@ -732,6 +830,9 @@
   </w:num>
   <w:num w:numId="9" w16cid:durableId="776943096">
     <w:abstractNumId w:val="0"/>
+  </w:num>
+  <w:num w:numId="10" w16cid:durableId="1179349344">
+    <w:abstractNumId w:val="9"/>
   </w:num>
 </w:numbering>
 </file>

</xml_diff>